<commit_message>
Raise pricing to 25/60 JOD with 15 JOD founding offer
</commit_message>
<xml_diff>
--- a/dukkani-outreach-messages.docx
+++ b/dukkani-outreach-messages.docx
@@ -715,7 +715,7 @@
       </w:r>
       <w:r>
         <w:rPr/>
-        <w:t>5</w:t>
+        <w:t>15</w:t>
       </w:r>
       <w:r>
         <w:rPr>
@@ -756,6 +756,12 @@
           <w:rtl w:val="true"/>
         </w:rPr>
         <w:t>مشروعًا</w:t>
+        <w:r>
+          <w:rPr>
+            <w:rtl w:val="true"/>
+          </w:rPr>
+          <w:t xml:space="preserve"> (بدلًا من 25 د.أ)</w:t>
+        </w:r>
       </w:r>
       <w:r>
         <w:rPr>
@@ -1399,7 +1405,7 @@
       </w:r>
       <w:r>
         <w:rPr/>
-        <w:t>5</w:t>
+        <w:t>15</w:t>
       </w:r>
       <w:r>
         <w:rPr>
@@ -1439,7 +1445,14 @@
         <w:rPr>
           <w:rtl w:val="true"/>
         </w:rPr>
-        <w:t>مشروعًا، وبدون عمولة على الطلبات</w:t>
+        <w:t>مشروعًا</w:t>
+        <w:r>
+          <w:rPr>
+            <w:rtl w:val="true"/>
+          </w:rPr>
+          <w:t xml:space="preserve"> (بدلًا من 25 د.أ)</w:t>
+        </w:r>
+        <w:t>، وبدون عمولة على الطلبات</w:t>
       </w:r>
       <w:r>
         <w:rPr>
@@ -2659,7 +2672,7 @@
       </w:r>
       <w:r>
         <w:rPr/>
-        <w:t>5</w:t>
+        <w:t>15</w:t>
       </w:r>
       <w:r>
         <w:rPr>
@@ -2699,7 +2712,14 @@
         <w:rPr>
           <w:rtl w:val="true"/>
         </w:rPr>
-        <w:t>مشروعًا، وبدون عمولة على الطلبات</w:t>
+        <w:t>مشروعًا</w:t>
+        <w:r>
+          <w:rPr>
+            <w:rtl w:val="true"/>
+          </w:rPr>
+          <w:t xml:space="preserve"> (بدلًا من 25 د.أ)</w:t>
+        </w:r>
+        <w:t>، وبدون عمولة على الطلبات</w:t>
       </w:r>
       <w:r>
         <w:rPr>

</xml_diff>

<commit_message>
Add no-link, decline, and "is it an app?" WhatsApp replies
- New section 8-أ: full details in chat for prospects who won't open links
- New section 8-ب: what to say when she says no (one message, then ask for a referral)
- New section 8-ج: answer to "it's a website, not an app, right?"
- Quick replies: /nolnk, /no, /later, /app
- New golden-rule bullets; DOCX/PDF regenerated (13 pages)
</commit_message>
<xml_diff>
--- a/dukkani-outreach-messages.docx
+++ b/dukkani-outreach-messages.docx
@@ -1851,6 +1851,1032 @@
         <w:rPr/>
       </w:pPr>
       <w:r>
+        <w:rPr/>
+        <w:t xml:space="preserve">8</w:t>
+      </w:r>
+      <w:r>
+        <w:rPr>
+          <w:rtl w:val="true"/>
+        </w:rPr>
+        <w:t xml:space="preserve">-أ) إذا قالت "ما بحب أفتح الروابط — ابعثلي التفاصيل هون"</w:t>
+      </w:r>
+    </w:p>
+    <w:p>
+      <w:pPr>
+        <w:pStyle w:val="BodyTextline"/>
+        <w:bidi w:val="1"/>
+        <w:jc w:val="left"/>
+        <w:rPr/>
+      </w:pPr>
+      <w:r>
+        <w:rPr>
+          <w:rtl w:val="true"/>
+        </w:rPr>
+        <w:t xml:space="preserve">كثير من الصانعات ما بيفتحن الروابط، أو ما بيثقن برابط من رقم جديد.</w:t>
+      </w:r>
+    </w:p>
+    <w:p>
+      <w:pPr>
+        <w:pStyle w:val="BodyTextline"/>
+        <w:bidi w:val="1"/>
+        <w:jc w:val="left"/>
+        <w:rPr/>
+      </w:pPr>
+      <w:r>
+        <w:rPr>
+          <w:rtl w:val="true"/>
+        </w:rPr>
+        <w:t xml:space="preserve">قاعدة: لا تدفعها للرابط. أرسل التفاصيل كاملة داخل الواتساب، واعرض إنك تجهّز المتجر بنفسك.</w:t>
+      </w:r>
+    </w:p>
+    <w:p>
+      <w:pPr>
+        <w:pStyle w:val="BodyTextline"/>
+        <w:bidi w:val="1"/>
+        <w:jc w:val="left"/>
+        <w:rPr/>
+      </w:pPr>
+      <w:r>
+        <w:rPr>
+          <w:rtl w:val="true"/>
+        </w:rPr>
+        <w:t xml:space="preserve">الرسالة الكاملة — الرد الأول:</w:t>
+      </w:r>
+    </w:p>
+    <w:p>
+      <w:pPr>
+        <w:pStyle w:val="BodyTextline"/>
+        <w:bidi w:val="1"/>
+        <w:jc w:val="left"/>
+        <w:rPr/>
+      </w:pPr>
+      <w:r>
+        <w:rPr>
+          <w:rtl w:val="true"/>
+        </w:rPr>
+        <w:t xml:space="preserve">أهلًا [الاسم] 👋 ولا يهمك، ما في داعي تفتحي أي رابط — بشرحلك كل شي هون بالواتساب.</w:t>
+      </w:r>
+    </w:p>
+    <w:p>
+      <w:pPr>
+        <w:pStyle w:val="BodyTextline"/>
+        <w:bidi w:val="1"/>
+        <w:jc w:val="left"/>
+        <w:rPr/>
+      </w:pPr>
+      <w:r>
+        <w:rPr>
+          <w:rtl w:val="true"/>
+        </w:rPr>
+        <w:t xml:space="preserve">دكاني أداة بسيطة لمشاريع المنزل، بالعربي، وبتعطيك:</w:t>
+      </w:r>
+    </w:p>
+    <w:p>
+      <w:pPr>
+        <w:pStyle w:val="BodyTextline"/>
+        <w:bidi w:val="1"/>
+        <w:jc w:val="left"/>
+        <w:rPr/>
+      </w:pPr>
+      <w:r>
+        <w:rPr>
+          <w:rtl w:val="true"/>
+        </w:rPr>
+        <w:t xml:space="preserve">• رابط متجر خاص فيك: منتجاتك وأسعارك</w:t>
+      </w:r>
+    </w:p>
+    <w:p>
+      <w:pPr>
+        <w:pStyle w:val="BodyTextline"/>
+        <w:bidi w:val="1"/>
+        <w:jc w:val="left"/>
+        <w:rPr/>
+      </w:pPr>
+      <w:r>
+        <w:rPr>
+          <w:rtl w:val="true"/>
+        </w:rPr>
+        <w:t xml:space="preserve">• لوحة طلبات: كل طلب يوصل بمكان واحد (جديد ← مؤكد ← تم التسليم)</w:t>
+      </w:r>
+    </w:p>
+    <w:p>
+      <w:pPr>
+        <w:pStyle w:val="BodyTextline"/>
+        <w:bidi w:val="1"/>
+        <w:jc w:val="left"/>
+        <w:rPr/>
+      </w:pPr>
+      <w:r>
+        <w:rPr>
+          <w:rtl w:val="true"/>
+        </w:rPr>
+        <w:t xml:space="preserve">• متابعة العربون: تعرفي مين دفع ومين لسا</w:t>
+      </w:r>
+    </w:p>
+    <w:p>
+      <w:pPr>
+        <w:pStyle w:val="BodyTextline"/>
+        <w:bidi w:val="1"/>
+        <w:jc w:val="left"/>
+        <w:rPr/>
+      </w:pPr>
+      <w:r>
+        <w:rPr>
+          <w:rtl w:val="true"/>
+        </w:rPr>
+        <w:t xml:space="preserve">• رسائل واتساب جاهزة بالعربي بضغطة وحدة</w:t>
+      </w:r>
+    </w:p>
+    <w:p>
+      <w:pPr>
+        <w:pStyle w:val="BodyTextline"/>
+        <w:bidi w:val="1"/>
+        <w:jc w:val="left"/>
+        <w:rPr/>
+      </w:pPr>
+      <w:r>
+        <w:rPr>
+          <w:rtl w:val="true"/>
+        </w:rPr>
+        <w:t xml:space="preserve">• سجل زبائناتك وتقارير بسيطة</w:t>
+      </w:r>
+    </w:p>
+    <w:p>
+      <w:pPr>
+        <w:pStyle w:val="BodyTextline"/>
+        <w:bidi w:val="1"/>
+        <w:jc w:val="left"/>
+        <w:rPr/>
+      </w:pPr>
+      <w:r>
+        <w:rPr>
+          <w:rtl w:val="true"/>
+        </w:rPr>
+        <w:t xml:space="preserve">وطريقة العمل أسهل من هيك: أنا بجهّزلك المتجر وأضيف منتجاتك وصورك بنفسي — إنتِ بس بتستلمي الطلبات. بدون أي عمولة على الطلبات.</w:t>
+      </w:r>
+    </w:p>
+    <w:p>
+      <w:pPr>
+        <w:pStyle w:val="BodyTextline"/>
+        <w:bidi w:val="1"/>
+        <w:jc w:val="left"/>
+        <w:rPr/>
+      </w:pPr>
+      <w:r>
+        <w:rPr>
+          <w:rtl w:val="true"/>
+        </w:rPr>
+        <w:t xml:space="preserve">السعر: التجربة مجانية </w:t>
+      </w:r>
+      <w:r>
+        <w:rPr/>
+        <w:t xml:space="preserve">14</w:t>
+      </w:r>
+      <w:r>
+        <w:rPr>
+          <w:rtl w:val="true"/>
+        </w:rPr>
+        <w:t xml:space="preserve"> يوم بدون التزام. بعدها </w:t>
+      </w:r>
+      <w:r>
+        <w:rPr/>
+        <w:t xml:space="preserve">15</w:t>
+      </w:r>
+      <w:r>
+        <w:rPr>
+          <w:rtl w:val="true"/>
+        </w:rPr>
+        <w:t xml:space="preserve"> د.أ بالشهر لأول </w:t>
+      </w:r>
+      <w:r>
+        <w:rPr/>
+        <w:t xml:space="preserve">20</w:t>
+      </w:r>
+      <w:r>
+        <w:rPr>
+          <w:rtl w:val="true"/>
+        </w:rPr>
+        <w:t xml:space="preserve"> مشروع (السعر العادي </w:t>
+      </w:r>
+      <w:r>
+        <w:rPr/>
+        <w:t xml:space="preserve">25</w:t>
+      </w:r>
+      <w:r>
+        <w:rPr>
+          <w:rtl w:val="true"/>
+        </w:rPr>
+        <w:t xml:space="preserve"> د.أ).</w:t>
+      </w:r>
+    </w:p>
+    <w:p>
+      <w:pPr>
+        <w:pStyle w:val="BodyTextline"/>
+        <w:bidi w:val="1"/>
+        <w:jc w:val="left"/>
+        <w:rPr/>
+      </w:pPr>
+      <w:r>
+        <w:rPr>
+          <w:rtl w:val="true"/>
+        </w:rPr>
+        <w:t xml:space="preserve">بتحبي أجهّزلك متجر تجريبي باسم مشروعك هالأسبوع؟ بتحتاجي بس اسم المشروع و</w:t>
+      </w:r>
+      <w:r>
+        <w:rPr/>
+        <w:t xml:space="preserve">3</w:t>
+      </w:r>
+      <w:r>
+        <w:rPr>
+          <w:rtl w:val="true"/>
+        </w:rPr>
+        <w:t xml:space="preserve">–</w:t>
+      </w:r>
+      <w:r>
+        <w:rPr/>
+        <w:t xml:space="preserve">4</w:t>
+      </w:r>
+      <w:r>
+        <w:rPr>
+          <w:rtl w:val="true"/>
+        </w:rPr>
+        <w:t xml:space="preserve"> صور لمنتجاتك 🙂</w:t>
+      </w:r>
+    </w:p>
+    <w:p>
+      <w:pPr>
+        <w:pStyle w:val="BodyTextline"/>
+        <w:bidi w:val="1"/>
+        <w:jc w:val="left"/>
+        <w:rPr/>
+      </w:pPr>
+      <w:r>
+        <w:rPr>
+          <w:rtl w:val="true"/>
+        </w:rPr>
+        <w:t xml:space="preserve">النسخة القصيرة (إذا حسّيتها طويلة):</w:t>
+      </w:r>
+    </w:p>
+    <w:p>
+      <w:pPr>
+        <w:pStyle w:val="BodyTextline"/>
+        <w:bidi w:val="1"/>
+        <w:jc w:val="left"/>
+        <w:rPr/>
+      </w:pPr>
+      <w:r>
+        <w:rPr>
+          <w:rtl w:val="true"/>
+        </w:rPr>
+        <w:t xml:space="preserve">أهلًا [الاسم] 👋 ولا يهمك. باختصار: دكاني بيعطيك رابط متجر + لوحة طلبات + متابعة عربون، بالعربي وبدون عمولة. أنا بجهّزلك المتجر بنفسي وبتستلمي الطلبات. تجربة مجانية </w:t>
+      </w:r>
+      <w:r>
+        <w:rPr/>
+        <w:t xml:space="preserve">14</w:t>
+      </w:r>
+      <w:r>
+        <w:rPr>
+          <w:rtl w:val="true"/>
+        </w:rPr>
+        <w:t xml:space="preserve"> يوم، وبعدها </w:t>
+      </w:r>
+      <w:r>
+        <w:rPr/>
+        <w:t xml:space="preserve">15</w:t>
+      </w:r>
+      <w:r>
+        <w:rPr>
+          <w:rtl w:val="true"/>
+        </w:rPr>
+        <w:t xml:space="preserve"> د.أ بالشهر. بتحبي أجهّزلك متجر تجريبي باسم مشروعك؟</w:t>
+      </w:r>
+    </w:p>
+    <w:p>
+      <w:pPr>
+        <w:pStyle w:val="BodyTextline"/>
+        <w:bidi w:val="1"/>
+        <w:jc w:val="left"/>
+        <w:rPr/>
+      </w:pPr>
+      <w:r>
+        <w:rPr>
+          <w:rtl w:val="true"/>
+        </w:rPr>
+        <w:t xml:space="preserve">ملاحظات لهذه الحالة:</w:t>
+      </w:r>
+    </w:p>
+    <w:p>
+      <w:pPr>
+        <w:pStyle w:val="BodyText"/>
+        <w:numPr>
+          <w:ilvl w:val="0"/>
+          <w:numId w:val="5"/>
+        </w:numPr>
+        <w:tabs>
+          <w:tab w:val="clear" w:pos="1134"/>
+          <w:tab w:val="left" w:pos="709" w:leader="none"/>
+        </w:tabs>
+        <w:bidi w:val="1"/>
+        <w:ind w:firstLine="992" w:left="709"/>
+        <w:jc w:val="left"/>
+        <w:rPr/>
+      </w:pPr>
+      <w:r>
+        <w:rPr>
+          <w:rtl w:val="true"/>
+        </w:rPr>
+        <w:t xml:space="preserve">لا ترسل الرابط إلا إذا طلبت هي تشوفه ("ابعثيلي الرابط").</w:t>
+      </w:r>
+    </w:p>
+    <w:p>
+      <w:pPr>
+        <w:pStyle w:val="BodyText"/>
+        <w:numPr>
+          <w:ilvl w:val="0"/>
+          <w:numId w:val="5"/>
+        </w:numPr>
+        <w:tabs>
+          <w:tab w:val="clear" w:pos="1134"/>
+          <w:tab w:val="left" w:pos="709" w:leader="none"/>
+        </w:tabs>
+        <w:bidi w:val="1"/>
+        <w:ind w:firstLine="992" w:left="709"/>
+        <w:jc w:val="left"/>
+        <w:rPr/>
+      </w:pPr>
+      <w:r>
+        <w:rPr>
+          <w:rtl w:val="true"/>
+        </w:rPr>
+        <w:t xml:space="preserve">العرض الأقوى: "أنا بجهّزلك المتجر" — يحوّل الرابط إلى شخص يقوم بالشغل بدل ما تفتحه هي.</w:t>
+      </w:r>
+    </w:p>
+    <w:p>
+      <w:pPr>
+        <w:pStyle w:val="BodyText"/>
+        <w:numPr>
+          <w:ilvl w:val="0"/>
+          <w:numId w:val="5"/>
+        </w:numPr>
+        <w:tabs>
+          <w:tab w:val="clear" w:pos="1134"/>
+          <w:tab w:val="left" w:pos="709" w:leader="none"/>
+        </w:tabs>
+        <w:bidi w:val="1"/>
+        <w:ind w:firstLine="992" w:left="709"/>
+        <w:jc w:val="left"/>
+        <w:rPr/>
+      </w:pPr>
+      <w:r>
+        <w:rPr>
+          <w:rtl w:val="true"/>
+        </w:rPr>
+        <w:t xml:space="preserve">إذا وافقت، انتقل فورًا إلى: "بتحتاجي بس اسم المشروع و</w:t>
+      </w:r>
+      <w:r>
+        <w:rPr/>
+        <w:t xml:space="preserve">3</w:t>
+      </w:r>
+      <w:r>
+        <w:rPr>
+          <w:rtl w:val="true"/>
+        </w:rPr>
+        <w:t xml:space="preserve">–</w:t>
+      </w:r>
+      <w:r>
+        <w:rPr/>
+        <w:t xml:space="preserve">4</w:t>
+      </w:r>
+      <w:r>
+        <w:rPr>
+          <w:rtl w:val="true"/>
+        </w:rPr>
+        <w:t xml:space="preserve"> صور" — أول خطوة عملية نحو التجربة المجانية.</w:t>
+      </w:r>
+    </w:p>
+    <w:p>
+      <w:pPr>
+        <w:pStyle w:val="Heading3"/>
+        <w:bidi w:val="1"/>
+        <w:jc w:val="left"/>
+        <w:rPr/>
+      </w:pPr>
+      <w:r>
+        <w:rPr/>
+        <w:t xml:space="preserve">8</w:t>
+      </w:r>
+      <w:r>
+        <w:rPr>
+          <w:rtl w:val="true"/>
+        </w:rPr>
+        <w:t xml:space="preserve">-ب) إذا قالت "ما بدي" أو "ما بحتاج"</w:t>
+      </w:r>
+    </w:p>
+    <w:p>
+      <w:pPr>
+        <w:pStyle w:val="BodyTextline"/>
+        <w:bidi w:val="1"/>
+        <w:jc w:val="left"/>
+        <w:rPr/>
+      </w:pPr>
+      <w:r>
+        <w:rPr>
+          <w:rtl w:val="true"/>
+        </w:rPr>
+        <w:t xml:space="preserve">قاعدة: الرفض يُحترم من أول مرة. لا سؤال ثاني، ولا محاولة إقناع، ولا "ليش؟".</w:t>
+      </w:r>
+    </w:p>
+    <w:p>
+      <w:pPr>
+        <w:pStyle w:val="BodyTextline"/>
+        <w:bidi w:val="1"/>
+        <w:jc w:val="left"/>
+        <w:rPr/>
+      </w:pPr>
+      <w:r>
+        <w:rPr>
+          <w:rtl w:val="true"/>
+        </w:rPr>
+        <w:t xml:space="preserve">الهدف من هذه الحالة: تخرج بكرامة + إحالة، وتحفظ الرد في ملف التتبع.</w:t>
+      </w:r>
+    </w:p>
+    <w:p>
+      <w:pPr>
+        <w:pStyle w:val="BodyTextline"/>
+        <w:bidi w:val="1"/>
+        <w:jc w:val="left"/>
+        <w:rPr/>
+      </w:pPr>
+      <w:r>
+        <w:rPr>
+          <w:rtl w:val="true"/>
+        </w:rPr>
+        <w:t xml:space="preserve">الرد الأساسي — "ما بدي" / "ما بحتاج":</w:t>
+      </w:r>
+    </w:p>
+    <w:p>
+      <w:pPr>
+        <w:pStyle w:val="BodyTextline"/>
+        <w:bidi w:val="1"/>
+        <w:jc w:val="left"/>
+        <w:rPr/>
+      </w:pPr>
+      <w:r>
+        <w:rPr>
+          <w:rtl w:val="true"/>
+        </w:rPr>
+        <w:t xml:space="preserve">تمام [الاسم]، ولا يهمك 🙏 وشكرًا إنك رديتي.</w:t>
+      </w:r>
+    </w:p>
+    <w:p>
+      <w:pPr>
+        <w:pStyle w:val="BodyTextline"/>
+        <w:bidi w:val="1"/>
+        <w:jc w:val="left"/>
+        <w:rPr/>
+      </w:pPr>
+      <w:r>
+        <w:rPr>
+          <w:rtl w:val="true"/>
+        </w:rPr>
+        <w:t xml:space="preserve">ما رح أضغط عليك، وسكّرت الموضوع من ناحيتي.</w:t>
+      </w:r>
+    </w:p>
+    <w:p>
+      <w:pPr>
+        <w:pStyle w:val="BodyTextline"/>
+        <w:bidi w:val="1"/>
+        <w:jc w:val="left"/>
+        <w:rPr/>
+      </w:pPr>
+      <w:r>
+        <w:rPr>
+          <w:rtl w:val="true"/>
+        </w:rPr>
+        <w:t xml:space="preserve">إذا بتعرفي صانعة منزل ممكن تستفيد من هيك أداة، ابعتيلي اسمها أو خليها تراسلني — بيساعدني كثير.</w:t>
+      </w:r>
+    </w:p>
+    <w:p>
+      <w:pPr>
+        <w:pStyle w:val="BodyTextline"/>
+        <w:bidi w:val="1"/>
+        <w:jc w:val="left"/>
+        <w:rPr/>
+      </w:pPr>
+      <w:r>
+        <w:rPr>
+          <w:rtl w:val="true"/>
+        </w:rPr>
+        <w:t xml:space="preserve">وإذا بعدين حبيتي تجربي، الرابط بضل موجود. بالتوفيق بمشروعك 🌸</w:t>
+      </w:r>
+    </w:p>
+    <w:p>
+      <w:pPr>
+        <w:pStyle w:val="BodyTextline"/>
+        <w:bidi w:val="1"/>
+        <w:jc w:val="left"/>
+        <w:rPr/>
+      </w:pPr>
+      <w:r>
+        <w:rPr>
+          <w:rtl w:val="true"/>
+        </w:rPr>
+        <w:t xml:space="preserve">إذا كان الرفض مؤقتًا — "ما عندي وقت" بس:</w:t>
+      </w:r>
+    </w:p>
+    <w:p>
+      <w:pPr>
+        <w:pStyle w:val="BodyTextline"/>
+        <w:bidi w:val="1"/>
+        <w:jc w:val="left"/>
+        <w:rPr/>
+      </w:pPr>
+      <w:r>
+        <w:rPr>
+          <w:rtl w:val="true"/>
+        </w:rPr>
+        <w:t xml:space="preserve">فهمتك 👍 بتركك على راحتك.</w:t>
+      </w:r>
+    </w:p>
+    <w:p>
+      <w:pPr>
+        <w:pStyle w:val="BodyTextline"/>
+        <w:bidi w:val="1"/>
+        <w:jc w:val="left"/>
+        <w:rPr/>
+      </w:pPr>
+      <w:r>
+        <w:rPr>
+          <w:rtl w:val="true"/>
+        </w:rPr>
+        <w:t xml:space="preserve">ممكن أرجع أراسلك مرة وحدة بعد شهر؟ وإذا حبيتي نختصرها بـ </w:t>
+      </w:r>
+      <w:r>
+        <w:rPr/>
+        <w:t xml:space="preserve">5</w:t>
+      </w:r>
+      <w:r>
+        <w:rPr>
+          <w:rtl w:val="true"/>
+        </w:rPr>
+        <w:t xml:space="preserve"> دقائق على الواتساب بأي وقت، أنا جاهز.</w:t>
+      </w:r>
+    </w:p>
+    <w:p>
+      <w:pPr>
+        <w:pStyle w:val="BodyTextline"/>
+        <w:bidi w:val="1"/>
+        <w:jc w:val="left"/>
+        <w:rPr/>
+      </w:pPr>
+      <w:r>
+        <w:rPr>
+          <w:rtl w:val="true"/>
+        </w:rPr>
+        <w:t xml:space="preserve">إذا رفضت الأداة بس ممكن تعطي رأي (الأهم للتحقق):</w:t>
+      </w:r>
+    </w:p>
+    <w:p>
+      <w:pPr>
+        <w:pStyle w:val="BodyTextline"/>
+        <w:bidi w:val="1"/>
+        <w:jc w:val="left"/>
+        <w:rPr/>
+      </w:pPr>
+      <w:r>
+        <w:rPr>
+          <w:rtl w:val="true"/>
+        </w:rPr>
+        <w:t xml:space="preserve">ولا يهمك، ما رح أزعجك بالأداة أبدًا.</w:t>
+      </w:r>
+    </w:p>
+    <w:p>
+      <w:pPr>
+        <w:pStyle w:val="BodyTextline"/>
+        <w:bidi w:val="1"/>
+        <w:jc w:val="left"/>
+        <w:rPr/>
+      </w:pPr>
+      <w:r>
+        <w:rPr>
+          <w:rtl w:val="true"/>
+        </w:rPr>
+        <w:t xml:space="preserve">بس إذا عندك </w:t>
+      </w:r>
+      <w:r>
+        <w:rPr/>
+        <w:t xml:space="preserve">5</w:t>
+      </w:r>
+      <w:r>
+        <w:rPr>
+          <w:rtl w:val="true"/>
+        </w:rPr>
+        <w:t xml:space="preserve"> دقائق تحكيلي شو بيزعجك أكثر شي بعملية الطلبات (وين بتضيع، ومين بتنسى العربون) — رأيك بيفرق كثير معي. وإذا ما حبيتي، ولا يهمك 🙏</w:t>
+      </w:r>
+    </w:p>
+    <w:p>
+      <w:pPr>
+        <w:pStyle w:val="BodyTextline"/>
+        <w:bidi w:val="1"/>
+        <w:jc w:val="left"/>
+        <w:rPr/>
+      </w:pPr>
+      <w:r>
+        <w:rPr>
+          <w:rtl w:val="true"/>
+        </w:rPr>
+        <w:t xml:space="preserve">ملاحظات مهمة لهذه الحالة:</w:t>
+      </w:r>
+    </w:p>
+    <w:p>
+      <w:pPr>
+        <w:pStyle w:val="BodyText"/>
+        <w:numPr>
+          <w:ilvl w:val="0"/>
+          <w:numId w:val="5"/>
+        </w:numPr>
+        <w:tabs>
+          <w:tab w:val="clear" w:pos="1134"/>
+          <w:tab w:val="left" w:pos="709" w:leader="none"/>
+        </w:tabs>
+        <w:bidi w:val="1"/>
+        <w:ind w:firstLine="992" w:left="709"/>
+        <w:jc w:val="left"/>
+        <w:rPr/>
+      </w:pPr>
+      <w:r>
+        <w:rPr>
+          <w:rtl w:val="true"/>
+        </w:rPr>
+        <w:t xml:space="preserve">لا ترسل أكثر من رسالة واحدة بعد الرفض.</w:t>
+      </w:r>
+    </w:p>
+    <w:p>
+      <w:pPr>
+        <w:pStyle w:val="BodyText"/>
+        <w:numPr>
+          <w:ilvl w:val="0"/>
+          <w:numId w:val="5"/>
+        </w:numPr>
+        <w:tabs>
+          <w:tab w:val="clear" w:pos="1134"/>
+          <w:tab w:val="left" w:pos="709" w:leader="none"/>
+        </w:tabs>
+        <w:bidi w:val="1"/>
+        <w:ind w:firstLine="992" w:left="709"/>
+        <w:jc w:val="left"/>
+        <w:rPr/>
+      </w:pPr>
+      <w:r>
+        <w:rPr>
+          <w:rtl w:val="true"/>
+        </w:rPr>
+        <w:t xml:space="preserve">لا تحاول مرة ثانية إلا إذا هي قالت "بعدين" — عندها رسالة واحدة بعد شهر.</w:t>
+      </w:r>
+    </w:p>
+    <w:p>
+      <w:pPr>
+        <w:pStyle w:val="BodyText"/>
+        <w:numPr>
+          <w:ilvl w:val="0"/>
+          <w:numId w:val="5"/>
+        </w:numPr>
+        <w:tabs>
+          <w:tab w:val="clear" w:pos="1134"/>
+          <w:tab w:val="left" w:pos="709" w:leader="none"/>
+        </w:tabs>
+        <w:bidi w:val="1"/>
+        <w:ind w:firstLine="992" w:left="709"/>
+        <w:jc w:val="left"/>
+        <w:rPr/>
+      </w:pPr>
+      <w:r>
+        <w:rPr>
+          <w:rtl w:val="true"/>
+        </w:rPr>
+        <w:t xml:space="preserve">اطلب إحالة (اسم صانعة ثانية) في كل رفض — كل رفض ممكن يعطيك عميل جديد.</w:t>
+      </w:r>
+    </w:p>
+    <w:p>
+      <w:pPr>
+        <w:pStyle w:val="BodyText"/>
+        <w:numPr>
+          <w:ilvl w:val="0"/>
+          <w:numId w:val="5"/>
+        </w:numPr>
+        <w:tabs>
+          <w:tab w:val="clear" w:pos="1134"/>
+          <w:tab w:val="left" w:pos="709" w:leader="none"/>
+        </w:tabs>
+        <w:bidi w:val="1"/>
+        <w:ind w:firstLine="992" w:left="709"/>
+        <w:jc w:val="left"/>
+        <w:rPr/>
+      </w:pPr>
+      <w:r>
+        <w:rPr>
+          <w:rtl w:val="true"/>
+        </w:rPr>
+        <w:t xml:space="preserve">سجّلها في ملف التتبع: الاسم، السبب إن ذكرته، والإحالة إن أعطتك وحدة.</w:t>
+      </w:r>
+    </w:p>
+    <w:p>
+      <w:pPr>
+        <w:pStyle w:val="Heading3"/>
+        <w:bidi w:val="1"/>
+        <w:jc w:val="left"/>
+        <w:rPr/>
+      </w:pPr>
+      <w:r>
+        <w:rPr/>
+        <w:t xml:space="preserve">8</w:t>
+      </w:r>
+      <w:r>
+        <w:rPr>
+          <w:rtl w:val="true"/>
+        </w:rPr>
+        <w:t xml:space="preserve">-ج) إذا سألت: "هو موقع مش تطبيق؟"</w:t>
+      </w:r>
+    </w:p>
+    <w:p>
+      <w:pPr>
+        <w:pStyle w:val="BodyTextline"/>
+        <w:bidi w:val="1"/>
+        <w:jc w:val="left"/>
+        <w:rPr/>
+      </w:pPr>
+      <w:r>
+        <w:rPr>
+          <w:rtl w:val="true"/>
+        </w:rPr>
+        <w:t xml:space="preserve">الرد: صادق ومباشر — إيه، موقع (رابط)، ولا هي ولا زبوناتها بينزّلوا شي.</w:t>
+      </w:r>
+    </w:p>
+    <w:p>
+      <w:pPr>
+        <w:pStyle w:val="BodyTextline"/>
+        <w:bidi w:val="1"/>
+        <w:jc w:val="left"/>
+        <w:rPr/>
+      </w:pPr>
+      <w:r>
+        <w:rPr>
+          <w:rtl w:val="true"/>
+        </w:rPr>
+        <w:t xml:space="preserve">التطبيق = ما توعد فيه. قول "إذا طلع تطبيق بالمستقبل بخبّرك" وبس.</w:t>
+      </w:r>
+    </w:p>
+    <w:p>
+      <w:pPr>
+        <w:pStyle w:val="BodyTextline"/>
+        <w:bidi w:val="1"/>
+        <w:jc w:val="left"/>
+        <w:rPr/>
+      </w:pPr>
+      <w:r>
+        <w:rPr>
+          <w:rtl w:val="true"/>
+        </w:rPr>
+        <w:t xml:space="preserve">الرد الأساسي:</w:t>
+      </w:r>
+    </w:p>
+    <w:p>
+      <w:pPr>
+        <w:pStyle w:val="BodyTextline"/>
+        <w:bidi w:val="1"/>
+        <w:jc w:val="left"/>
+        <w:rPr/>
+      </w:pPr>
+      <w:r>
+        <w:rPr>
+          <w:rtl w:val="true"/>
+        </w:rPr>
+        <w:t xml:space="preserve">مزبوط 👍 دكاني موقع (رابط) — ما في شي تنزّليه على الموبايل، ولا إنتِ ولا زبوناتك.</w:t>
+      </w:r>
+    </w:p>
+    <w:p>
+      <w:pPr>
+        <w:pStyle w:val="BodyTextline"/>
+        <w:bidi w:val="1"/>
+        <w:jc w:val="left"/>
+        <w:rPr/>
+      </w:pPr>
+      <w:r>
+        <w:rPr>
+          <w:rtl w:val="true"/>
+        </w:rPr>
+        <w:t xml:space="preserve">بتفتحي الرابط من المتصفح على موبايلك أو اللابتوب، وكل شي بمكان واحد: المتجر، الطلبات، والعربون.</w:t>
+      </w:r>
+    </w:p>
+    <w:p>
+      <w:pPr>
+        <w:pStyle w:val="BodyTextline"/>
+        <w:bidi w:val="1"/>
+        <w:jc w:val="left"/>
+        <w:rPr/>
+      </w:pPr>
+      <w:r>
+        <w:rPr>
+          <w:rtl w:val="true"/>
+        </w:rPr>
+        <w:t xml:space="preserve">وإذا حبيتي حسيته متل التطبيق، بتقدري تعملي الرابط أيقونة على الشاشة الرئيسية بضغطة — بيطلعلك بالضبط متل تطبيق، بس بدون تحديثات وبلا ما ياخد مكان على الذاكرة.</w:t>
+      </w:r>
+    </w:p>
+    <w:p>
+      <w:pPr>
+        <w:pStyle w:val="BodyTextline"/>
+        <w:bidi w:val="1"/>
+        <w:jc w:val="left"/>
+        <w:rPr/>
+      </w:pPr>
+      <w:r>
+        <w:rPr>
+          <w:rtl w:val="true"/>
+        </w:rPr>
+        <w:t xml:space="preserve">زبوناتك كمان ما بينزّلوا شي: بيفتحوا اللينك وبيطلبوا مباشرة — وهيك فينا نطلّع الطلب أسرع.</w:t>
+      </w:r>
+    </w:p>
+    <w:p>
+      <w:pPr>
+        <w:pStyle w:val="BodyTextline"/>
+        <w:bidi w:val="1"/>
+        <w:jc w:val="left"/>
+        <w:rPr/>
+      </w:pPr>
+      <w:r>
+        <w:rPr>
+          <w:rtl w:val="true"/>
+        </w:rPr>
+        <w:t xml:space="preserve">إذا كان همّها "بدي تطبيق" بالتحديد:</w:t>
+      </w:r>
+    </w:p>
+    <w:p>
+      <w:pPr>
+        <w:pStyle w:val="BodyTextline"/>
+        <w:bidi w:val="1"/>
+        <w:jc w:val="left"/>
+        <w:rPr/>
+      </w:pPr>
+      <w:r>
+        <w:rPr>
+          <w:rtl w:val="true"/>
+        </w:rPr>
+        <w:t xml:space="preserve">ما عندي تطبيق حاليًا، وبكون صريح معك: الموقع بيعمل نفس الشغل وبأسرع. وإذا طلع تطبيق بالمستقبل، إنتِ أول وحدة بخبّرها.</w:t>
+      </w:r>
+    </w:p>
+    <w:p>
+      <w:pPr>
+        <w:pStyle w:val="BodyTextline"/>
+        <w:bidi w:val="1"/>
+        <w:jc w:val="left"/>
+        <w:rPr/>
+      </w:pPr>
+      <w:r>
+        <w:rPr>
+          <w:rtl w:val="true"/>
+        </w:rPr>
+        <w:t xml:space="preserve">بس إذا التطبيق مهم عندك بشكل خاص، احكيلي — رأيك بيفرق معي في القرار.</w:t>
+      </w:r>
+    </w:p>
+    <w:p>
+      <w:pPr>
+        <w:pStyle w:val="BodyTextline"/>
+        <w:bidi w:val="1"/>
+        <w:jc w:val="left"/>
+        <w:rPr/>
+      </w:pPr>
+      <w:r>
+        <w:rPr>
+          <w:rtl w:val="true"/>
+        </w:rPr>
+        <w:t xml:space="preserve">النقلة بعد الرد:</w:t>
+      </w:r>
+    </w:p>
+    <w:p>
+      <w:pPr>
+        <w:pStyle w:val="BodyTextline"/>
+        <w:bidi w:val="1"/>
+        <w:jc w:val="left"/>
+        <w:rPr/>
+      </w:pPr>
+      <w:r>
+        <w:rPr>
+          <w:rtl w:val="true"/>
+        </w:rPr>
+        <w:t xml:space="preserve">بتحبي تكون أول وحدة تجرب المتجر على موبايلك؟ بجهّزلك واحد باسم مشروعك.</w:t>
+      </w:r>
+    </w:p>
+    <w:p>
+      <w:pPr>
+        <w:pStyle w:val="BodyTextline"/>
+        <w:bidi w:val="1"/>
+        <w:jc w:val="left"/>
+        <w:rPr/>
+      </w:pPr>
+      <w:r>
+        <w:rPr>
+          <w:rtl w:val="true"/>
+        </w:rPr>
+        <w:t xml:space="preserve">ملاحظات هذه الحالة:</w:t>
+      </w:r>
+    </w:p>
+    <w:p>
+      <w:pPr>
+        <w:pStyle w:val="BodyText"/>
+        <w:numPr>
+          <w:ilvl w:val="0"/>
+          <w:numId w:val="5"/>
+        </w:numPr>
+        <w:tabs>
+          <w:tab w:val="clear" w:pos="1134"/>
+          <w:tab w:val="left" w:pos="709" w:leader="none"/>
+        </w:tabs>
+        <w:bidi w:val="1"/>
+        <w:ind w:firstLine="992" w:left="709"/>
+        <w:jc w:val="left"/>
+        <w:rPr/>
+      </w:pPr>
+      <w:r>
+        <w:rPr>
+          <w:rtl w:val="true"/>
+        </w:rPr>
+        <w:t xml:space="preserve">لا تقل "رح يصير في تطبيق" — وعد ما بتقدر عليه هلق.</w:t>
+      </w:r>
+    </w:p>
+    <w:p>
+      <w:pPr>
+        <w:pStyle w:val="BodyText"/>
+        <w:numPr>
+          <w:ilvl w:val="0"/>
+          <w:numId w:val="5"/>
+        </w:numPr>
+        <w:tabs>
+          <w:tab w:val="clear" w:pos="1134"/>
+          <w:tab w:val="left" w:pos="709" w:leader="none"/>
+        </w:tabs>
+        <w:bidi w:val="1"/>
+        <w:ind w:firstLine="992" w:left="709"/>
+        <w:jc w:val="left"/>
+        <w:rPr/>
+      </w:pPr>
+      <w:r>
+        <w:rPr>
+          <w:rtl w:val="true"/>
+        </w:rPr>
+        <w:t xml:space="preserve">"أيقونة على الشاشة الرئيسية" ميزة حقيقية في المتصفح: أضف إلى الشاشة الرئيسية.</w:t>
+      </w:r>
+    </w:p>
+    <w:p>
+      <w:pPr>
+        <w:pStyle w:val="BodyText"/>
+        <w:numPr>
+          <w:ilvl w:val="0"/>
+          <w:numId w:val="5"/>
+        </w:numPr>
+        <w:tabs>
+          <w:tab w:val="clear" w:pos="1134"/>
+          <w:tab w:val="left" w:pos="709" w:leader="none"/>
+        </w:tabs>
+        <w:bidi w:val="1"/>
+        <w:ind w:firstLine="992" w:left="709"/>
+        <w:jc w:val="left"/>
+        <w:rPr/>
+      </w:pPr>
+      <w:r>
+        <w:rPr>
+          <w:rtl w:val="true"/>
+        </w:rPr>
+        <w:t xml:space="preserve">آيفون: </w:t>
+      </w:r>
+      <w:r>
+        <w:rPr/>
+        <w:t xml:space="preserve">Safari</w:t>
+      </w:r>
+      <w:r>
+        <w:rPr>
+          <w:rtl w:val="true"/>
+        </w:rPr>
+        <w:t xml:space="preserve"> → مشاركة → إضافة إلى الشاشة الرئيسية. أندرويد: </w:t>
+      </w:r>
+      <w:r>
+        <w:rPr/>
+        <w:t xml:space="preserve">Chrome</w:t>
+      </w:r>
+      <w:r>
+        <w:rPr>
+          <w:rtl w:val="true"/>
+        </w:rPr>
+        <w:t xml:space="preserve"> → ⋮ → إضافة إلى الشاشة الرئيسية.</w:t>
+      </w:r>
+    </w:p>
+    <w:p>
+      <w:pPr>
+        <w:pStyle w:val="Heading3"/>
+        <w:bidi w:val="1"/>
+        <w:jc w:val="left"/>
+        <w:rPr/>
+      </w:pPr>
+      <w:r>
         <w:rPr>
           <w:rtl w:val="true"/>
         </w:rPr>
@@ -2046,6 +3072,92 @@
           <w:rtl w:val="true"/>
         </w:rPr>
         <w:t>.</w:t>
+      </w:r>
+    </w:p>
+    <w:p>
+      <w:pPr>
+        <w:pStyle w:val="BodyText"/>
+        <w:numPr>
+          <w:ilvl w:val="0"/>
+          <w:numId w:val="5"/>
+        </w:numPr>
+        <w:tabs>
+          <w:tab w:val="clear" w:pos="1134"/>
+          <w:tab w:val="left" w:pos="709" w:leader="none"/>
+        </w:tabs>
+        <w:bidi w:val="1"/>
+        <w:ind w:firstLine="992" w:left="709"/>
+        <w:jc w:val="left"/>
+        <w:rPr/>
+      </w:pPr>
+      <w:r>
+        <w:rPr>
+          <w:rtl w:val="true"/>
+        </w:rPr>
+        <w:t xml:space="preserve">لا تدفع أحدًا لفتح الرابط: إذا تردّدت أو قالت "ما بحب أفتح الروابط"، أرسل التفاصيل كاملة داخل الواتساب (شوف </w:t>
+      </w:r>
+      <w:r>
+        <w:rPr/>
+        <w:t xml:space="preserve">8</w:t>
+      </w:r>
+      <w:r>
+        <w:rPr>
+          <w:rtl w:val="true"/>
+        </w:rPr>
+        <w:t xml:space="preserve">-أ و /</w:t>
+      </w:r>
+      <w:r>
+        <w:rPr/>
+        <w:t xml:space="preserve">nolnk</w:t>
+      </w:r>
+      <w:r>
+        <w:rPr>
+          <w:rtl w:val="true"/>
+        </w:rPr>
+        <w:t xml:space="preserve">).</w:t>
+      </w:r>
+    </w:p>
+    <w:p>
+      <w:pPr>
+        <w:pStyle w:val="BodyText"/>
+        <w:numPr>
+          <w:ilvl w:val="0"/>
+          <w:numId w:val="5"/>
+        </w:numPr>
+        <w:tabs>
+          <w:tab w:val="clear" w:pos="1134"/>
+          <w:tab w:val="left" w:pos="709" w:leader="none"/>
+        </w:tabs>
+        <w:bidi w:val="1"/>
+        <w:ind w:firstLine="992" w:left="709"/>
+        <w:jc w:val="left"/>
+        <w:rPr/>
+      </w:pPr>
+      <w:r>
+        <w:rPr>
+          <w:rtl w:val="true"/>
+        </w:rPr>
+        <w:t xml:space="preserve">لا تحاول الإقناع بعد الرفض: رسالة واحدة فقط، ثم اطلب إحالة (شوف </w:t>
+      </w:r>
+      <w:r>
+        <w:rPr/>
+        <w:t xml:space="preserve">8</w:t>
+      </w:r>
+      <w:r>
+        <w:rPr>
+          <w:rtl w:val="true"/>
+        </w:rPr>
+        <w:t xml:space="preserve">-ب و /</w:t>
+      </w:r>
+      <w:r>
+        <w:rPr/>
+        <w:t xml:space="preserve">no</w:t>
+      </w:r>
+      <w:r>
+        <w:rPr>
+          <w:rtl w:val="true"/>
+        </w:rPr>
+        <w:t xml:space="preserve">).</w:t>
       </w:r>
     </w:p>
     <w:p>
@@ -2935,6 +4047,374 @@
           <w:rtl w:val="true"/>
         </w:rPr>
         <w:t>بتحبي أجهزلك تجربة مجانية تشوفيها بنفسك؟</w:t>
+      </w:r>
+    </w:p>
+    <w:p>
+      <w:pPr>
+        <w:pStyle w:val="BodyTextshort"/>
+        <w:bidi w:val="0"/>
+        <w:ind w:hanging="0" w:left="113" w:right="113"/>
+        <w:rPr/>
+      </w:pPr>
+      <w:r>
+        <w:rPr>
+          <w:rFonts w:ascii="DejaVu Sans;sans-serif" w:hAnsi="DejaVu Sans;sans-serif"/>
+          <w:b/>
+          <w:color w:val="7C2D12"/>
+          <w:shd w:fill="F6E8D8" w:val="clear"/>
+        </w:rPr>
+        <w:t xml:space="preserve">/nolnk</w:t>
+      </w:r>
+      <w:r>
+        <w:rPr>
+          <w:color w:val="B45309"/>
+        </w:rPr>
+        <w:t xml:space="preserve"> ← </w:t>
+      </w:r>
+      <w:r>
+        <w:rPr>
+          <w:rtl w:val="true"/>
+        </w:rPr>
+        <w:t xml:space="preserve">إذا قالت "ما بحب أفتح الروابط، ابعثلي التفاصيل"</w:t>
+      </w:r>
+    </w:p>
+    <w:p>
+      <w:pPr>
+        <w:pStyle w:val="BodyTextline"/>
+        <w:bidi w:val="1"/>
+        <w:jc w:val="left"/>
+        <w:rPr/>
+      </w:pPr>
+      <w:r>
+        <w:rPr>
+          <w:rtl w:val="true"/>
+        </w:rPr>
+        <w:t xml:space="preserve">أهلًا 👋 ولا يهمك، ما في داعي تفتحي أي رابط — بشرحلك كل شي هون بالواتساب.</w:t>
+      </w:r>
+    </w:p>
+    <w:p>
+      <w:pPr>
+        <w:pStyle w:val="BodyTextline"/>
+        <w:bidi w:val="1"/>
+        <w:jc w:val="left"/>
+        <w:rPr/>
+      </w:pPr>
+      <w:r>
+        <w:rPr>
+          <w:rtl w:val="true"/>
+        </w:rPr>
+        <w:t xml:space="preserve">دكاني أداة بسيطة لمشاريع المنزل، بالعربي، وبتعطيك: رابط متجر خاص فيك، لوحة طلبات (جديد ← مؤكد ← تم التسليم)، متابعة العربون، رسائل واتساب جاهزة، سجل زبائناتك، وتقارير بسيطة.</w:t>
+      </w:r>
+    </w:p>
+    <w:p>
+      <w:pPr>
+        <w:pStyle w:val="BodyTextline"/>
+        <w:bidi w:val="1"/>
+        <w:jc w:val="left"/>
+        <w:rPr/>
+      </w:pPr>
+      <w:r>
+        <w:rPr>
+          <w:rtl w:val="true"/>
+        </w:rPr>
+        <w:t xml:space="preserve">وطريقة العمل أسهل من هيك: أنا بجهّزلك المتجر وأضيف منتجاتك وصورك بنفسي — إنتِ بس بتستلمي الطلبات. بدون أي عمولة على الطلبات.</w:t>
+      </w:r>
+    </w:p>
+    <w:p>
+      <w:pPr>
+        <w:pStyle w:val="BodyTextline"/>
+        <w:bidi w:val="1"/>
+        <w:jc w:val="left"/>
+        <w:rPr/>
+      </w:pPr>
+      <w:r>
+        <w:rPr>
+          <w:rtl w:val="true"/>
+        </w:rPr>
+        <w:t xml:space="preserve">السعر: التجربة مجانية </w:t>
+      </w:r>
+      <w:r>
+        <w:rPr/>
+        <w:t xml:space="preserve">14</w:t>
+      </w:r>
+      <w:r>
+        <w:rPr>
+          <w:rtl w:val="true"/>
+        </w:rPr>
+        <w:t xml:space="preserve"> يوم بدون التزام، وبعدها </w:t>
+      </w:r>
+      <w:r>
+        <w:rPr/>
+        <w:t xml:space="preserve">15</w:t>
+      </w:r>
+      <w:r>
+        <w:rPr>
+          <w:rtl w:val="true"/>
+        </w:rPr>
+        <w:t xml:space="preserve"> د.أ بالشهر لأول </w:t>
+      </w:r>
+      <w:r>
+        <w:rPr/>
+        <w:t xml:space="preserve">20</w:t>
+      </w:r>
+      <w:r>
+        <w:rPr>
+          <w:rtl w:val="true"/>
+        </w:rPr>
+        <w:t xml:space="preserve"> مشروع (بدلًا من </w:t>
+      </w:r>
+      <w:r>
+        <w:rPr/>
+        <w:t xml:space="preserve">25</w:t>
+      </w:r>
+      <w:r>
+        <w:rPr>
+          <w:rtl w:val="true"/>
+        </w:rPr>
+        <w:t xml:space="preserve"> د.أ).</w:t>
+      </w:r>
+    </w:p>
+    <w:p>
+      <w:pPr>
+        <w:pStyle w:val="BodyTextline"/>
+        <w:bidi w:val="1"/>
+        <w:jc w:val="left"/>
+        <w:rPr/>
+      </w:pPr>
+      <w:r>
+        <w:rPr>
+          <w:rtl w:val="true"/>
+        </w:rPr>
+        <w:t xml:space="preserve">بتحبي أجهّزلك متجر تجريبي باسم مشروعك هالأسبوع؟ بتحتاجي بس اسم المشروع و</w:t>
+      </w:r>
+      <w:r>
+        <w:rPr/>
+        <w:t xml:space="preserve">3</w:t>
+      </w:r>
+      <w:r>
+        <w:rPr>
+          <w:rtl w:val="true"/>
+        </w:rPr>
+        <w:t xml:space="preserve">–</w:t>
+      </w:r>
+      <w:r>
+        <w:rPr/>
+        <w:t xml:space="preserve">4</w:t>
+      </w:r>
+      <w:r>
+        <w:rPr>
+          <w:rtl w:val="true"/>
+        </w:rPr>
+        <w:t xml:space="preserve"> صور لمنتجاتك 🙂</w:t>
+      </w:r>
+    </w:p>
+    <w:p>
+      <w:pPr>
+        <w:pStyle w:val="BodyTextshort"/>
+        <w:bidi w:val="0"/>
+        <w:ind w:hanging="0" w:left="113" w:right="113"/>
+        <w:rPr/>
+      </w:pPr>
+      <w:r>
+        <w:rPr>
+          <w:rFonts w:ascii="DejaVu Sans;sans-serif" w:hAnsi="DejaVu Sans;sans-serif"/>
+          <w:b/>
+          <w:color w:val="7C2D12"/>
+          <w:shd w:fill="F6E8D8" w:val="clear"/>
+        </w:rPr>
+        <w:t xml:space="preserve">/no</w:t>
+      </w:r>
+      <w:r>
+        <w:rPr>
+          <w:color w:val="B45309"/>
+        </w:rPr>
+        <w:t xml:space="preserve"> ← </w:t>
+      </w:r>
+      <w:r>
+        <w:rPr>
+          <w:rtl w:val="true"/>
+        </w:rPr>
+        <w:t xml:space="preserve">إذا قالت "ما بدي" / "ما بحتاج"</w:t>
+      </w:r>
+    </w:p>
+    <w:p>
+      <w:pPr>
+        <w:pStyle w:val="BodyTextline"/>
+        <w:bidi w:val="1"/>
+        <w:jc w:val="left"/>
+        <w:rPr/>
+      </w:pPr>
+      <w:r>
+        <w:rPr>
+          <w:rtl w:val="true"/>
+        </w:rPr>
+        <w:t xml:space="preserve">تمام 👋 ولا يهمك، وشكرًا إنك رديتي. ما رح أضغط عليك، وسكّرت الموضوع من ناحيتي.</w:t>
+      </w:r>
+    </w:p>
+    <w:p>
+      <w:pPr>
+        <w:pStyle w:val="BodyTextline"/>
+        <w:bidi w:val="1"/>
+        <w:jc w:val="left"/>
+        <w:rPr/>
+      </w:pPr>
+      <w:r>
+        <w:rPr>
+          <w:rtl w:val="true"/>
+        </w:rPr>
+        <w:t xml:space="preserve">إذا بتعرفي صانعة منزل ممكن تستفيد، ابعتيلي اسمها أو خليها تراسلني — بيساعدني كثير.</w:t>
+      </w:r>
+    </w:p>
+    <w:p>
+      <w:pPr>
+        <w:pStyle w:val="BodyTextline"/>
+        <w:bidi w:val="1"/>
+        <w:jc w:val="left"/>
+        <w:rPr/>
+      </w:pPr>
+      <w:r>
+        <w:rPr>
+          <w:rtl w:val="true"/>
+        </w:rPr>
+        <w:t xml:space="preserve">وإذا بعدين حبيتي تجربي، الرابط بضل موجود. بالتوفيق بمشروعك 🌸</w:t>
+      </w:r>
+    </w:p>
+    <w:p>
+      <w:pPr>
+        <w:pStyle w:val="BodyTextshort"/>
+        <w:bidi w:val="0"/>
+        <w:ind w:hanging="0" w:left="113" w:right="113"/>
+        <w:rPr/>
+      </w:pPr>
+      <w:r>
+        <w:rPr>
+          <w:rFonts w:ascii="DejaVu Sans;sans-serif" w:hAnsi="DejaVu Sans;sans-serif"/>
+          <w:b/>
+          <w:color w:val="7C2D12"/>
+          <w:shd w:fill="F6E8D8" w:val="clear"/>
+        </w:rPr>
+        <w:t xml:space="preserve">/later</w:t>
+      </w:r>
+      <w:r>
+        <w:rPr>
+          <w:color w:val="B45309"/>
+        </w:rPr>
+        <w:t xml:space="preserve"> ← </w:t>
+      </w:r>
+      <w:r>
+        <w:rPr>
+          <w:rtl w:val="true"/>
+        </w:rPr>
+        <w:t xml:space="preserve">إذا قالت "بعدين" / "ما عندي وقت هالفترة"</w:t>
+      </w:r>
+    </w:p>
+    <w:p>
+      <w:pPr>
+        <w:pStyle w:val="BodyTextline"/>
+        <w:bidi w:val="1"/>
+        <w:jc w:val="left"/>
+        <w:rPr/>
+      </w:pPr>
+      <w:r>
+        <w:rPr>
+          <w:rtl w:val="true"/>
+        </w:rPr>
+        <w:t xml:space="preserve">فهمتك 👍 بتركك على راحتك. ممكن أرجع أراسلك مرة وحدة بعد شهر؟ وإذا حبيتي نختصرها بـ </w:t>
+      </w:r>
+      <w:r>
+        <w:rPr/>
+        <w:t xml:space="preserve">5</w:t>
+      </w:r>
+      <w:r>
+        <w:rPr>
+          <w:rtl w:val="true"/>
+        </w:rPr>
+        <w:t xml:space="preserve"> دقائق على الواتساب بأي وقت، أنا جاهز.</w:t>
+      </w:r>
+    </w:p>
+    <w:p>
+      <w:pPr>
+        <w:pStyle w:val="BodyTextshort"/>
+        <w:bidi w:val="0"/>
+        <w:ind w:hanging="0" w:left="113" w:right="113"/>
+        <w:rPr/>
+      </w:pPr>
+      <w:r>
+        <w:rPr>
+          <w:rFonts w:ascii="DejaVu Sans;sans-serif" w:hAnsi="DejaVu Sans;sans-serif"/>
+          <w:b/>
+          <w:color w:val="7C2D12"/>
+          <w:shd w:fill="F6E8D8" w:val="clear"/>
+        </w:rPr>
+        <w:t xml:space="preserve">/app</w:t>
+      </w:r>
+      <w:r>
+        <w:rPr>
+          <w:color w:val="B45309"/>
+        </w:rPr>
+        <w:t xml:space="preserve"> ← </w:t>
+      </w:r>
+      <w:r>
+        <w:rPr>
+          <w:rtl w:val="true"/>
+        </w:rPr>
+        <w:t xml:space="preserve">إذا سألت "هو موقع مش تطبيق؟"</w:t>
+      </w:r>
+    </w:p>
+    <w:p>
+      <w:pPr>
+        <w:pStyle w:val="BodyTextline"/>
+        <w:bidi w:val="1"/>
+        <w:jc w:val="left"/>
+        <w:rPr/>
+      </w:pPr>
+      <w:r>
+        <w:rPr>
+          <w:rtl w:val="true"/>
+        </w:rPr>
+        <w:t xml:space="preserve">مزبوط 👍 دكاني موقع (رابط) — ما في شي تنزّليه على الموبايل، ولا إنتِ ولا زبوناتك.</w:t>
+      </w:r>
+    </w:p>
+    <w:p>
+      <w:pPr>
+        <w:pStyle w:val="BodyTextline"/>
+        <w:bidi w:val="1"/>
+        <w:jc w:val="left"/>
+        <w:rPr/>
+      </w:pPr>
+      <w:r>
+        <w:rPr>
+          <w:rtl w:val="true"/>
+        </w:rPr>
+        <w:t xml:space="preserve">بتفتحي الرابط من المتصفح، وكل شي بمكان واحد: المتجر، الطلبات، والعربون.</w:t>
+      </w:r>
+    </w:p>
+    <w:p>
+      <w:pPr>
+        <w:pStyle w:val="BodyTextline"/>
+        <w:bidi w:val="1"/>
+        <w:jc w:val="left"/>
+        <w:rPr/>
+      </w:pPr>
+      <w:r>
+        <w:rPr>
+          <w:rtl w:val="true"/>
+        </w:rPr>
+        <w:t xml:space="preserve">وإذا حبيتي حسيته متل التطبيق، بتقدري تعملي الرابط أيقونة على الشاشة الرئيسية بضغطة — بيطلعلك متل تطبيق، بدون تحديثات وبلا ما ياخد مكان على الذاكرة.</w:t>
+      </w:r>
+    </w:p>
+    <w:p>
+      <w:pPr>
+        <w:pStyle w:val="BodyTextline"/>
+        <w:bidi w:val="1"/>
+        <w:jc w:val="left"/>
+        <w:rPr/>
+      </w:pPr>
+      <w:r>
+        <w:rPr>
+          <w:rtl w:val="true"/>
+        </w:rPr>
+        <w:t xml:space="preserve">بتحبي تكون أول وحدة تجرب المتجر على موبايلك؟</w:t>
       </w:r>
     </w:p>
     <w:p>

</xml_diff>